<commit_message>
feat: Add 120B and 120C to period dropdown & remove 103-110
</commit_message>
<xml_diff>
--- a/CHUYEN_DE_TOAN_5_EDUROBOT_5.docx
+++ b/CHUYEN_DE_TOAN_5_EDUROBOT_5.docx
@@ -42,7 +42,6 @@
         <w:t>ỨNG DỤNG NỀN TẢNG EDUROBOT-5 TRONG DẠY HỌC TOÁN LỚP 5 THEO HƯỚNG TƯƠNG TÁC VÀ PHÁT TRIỂN NĂNG LỰC SỐ</w:t>
       </w:r>
     </w:p>
-    <w:p/>
     <w:p>
       <w:pPr>
         <w:pStyle w:val="Heading1"/>
@@ -621,7 +620,6 @@
         <w:rPr>
           <w:rFonts w:ascii="Times New Roman" w:hAnsi="Times New Roman" w:cs="Times New Roman"/>
         </w:rPr>
-        <w:lastRenderedPageBreak/>
         <w:t>V. KẾT LUẬN</w:t>
       </w:r>
     </w:p>
@@ -645,7 +643,7 @@
     </w:p>
     <w:sectPr>
       <w:pgSz w:w="12240" w:h="15840"/>
-      <w:pgMar w:top="1134" w:right="851" w:bottom="851" w:left="1134" w:header="720" w:footer="720" w:gutter="0"/>
+      <w:pgMar w:top="709" w:right="851" w:bottom="426" w:left="1134" w:header="720" w:footer="720" w:gutter="0"/>
       <w:cols w:space="720"/>
       <w:docGrid w:linePitch="360"/>
     </w:sectPr>

</xml_diff>